<commit_message>
atualização do trabalho escrito
</commit_message>
<xml_diff>
--- a/versões anteriores/TCC2/analise_sentimento_previsao_demanda.docx
+++ b/versões anteriores/TCC2/analise_sentimento_previsao_demanda.docx
@@ -10411,12 +10411,12 @@
           <wp:inline distB="114300" distT="114300" distL="114300" distR="114300">
             <wp:extent cx="5477828" cy="3295751"/>
             <wp:effectExtent b="0" l="0" r="0" t="0"/>
-            <wp:docPr id="15" name="image2.png"/>
+            <wp:docPr id="16" name="image4.png"/>
             <a:graphic>
               <a:graphicData uri="http://schemas.openxmlformats.org/drawingml/2006/picture">
                 <pic:pic>
                   <pic:nvPicPr>
-                    <pic:cNvPr id="0" name="image2.png"/>
+                    <pic:cNvPr id="0" name="image4.png"/>
                     <pic:cNvPicPr preferRelativeResize="0"/>
                   </pic:nvPicPr>
                   <pic:blipFill>
@@ -11644,22 +11644,544 @@
         <w:pStyle w:val="Heading2"/>
         <w:spacing w:after="300" w:before="300" w:line="240" w:lineRule="auto"/>
         <w:rPr/>
+      </w:pPr>
+      <w:bookmarkStart w:colFirst="0" w:colLast="0" w:name="_heading=h.kdbjggv78l1q" w:id="39"/>
+      <w:bookmarkEnd w:id="39"/>
+      <w:r>
+        <w:rPr>
+          <w:rtl w:val="0"/>
+        </w:rPr>
+        <w:t xml:space="preserve">3.2 Métodos </w:t>
+      </w:r>
+      <w:r>
+        <w:rPr>
+          <w:rtl w:val="0"/>
+        </w:rPr>
+      </w:r>
+    </w:p>
+    <w:p>
+      <w:pPr>
+        <w:spacing w:line="360" w:lineRule="auto"/>
+        <w:ind w:firstLine="850.3937007874017"/>
+        <w:rPr/>
+      </w:pPr>
+      <w:r>
+        <w:rPr>
+          <w:rtl w:val="0"/>
+        </w:rPr>
+        <w:t xml:space="preserve">Ao longo do desenvolvimento do projeto foram tomadas decisões baseadas numa metodologia constituída por: análise inicial dos dados, tratamentos iniciais, análise exploratória de dados, processamento de linguagem natural e treinamento de modelos de aprendizado de máquina. Para melhor entendimento de cada etapa da metodologia aplicada, cada ponto foi explicado individualmente neste trabalho escrito. </w:t>
+      </w:r>
+    </w:p>
+    <w:p>
+      <w:pPr>
+        <w:pStyle w:val="Heading3"/>
+        <w:spacing w:after="300" w:before="300" w:line="240" w:lineRule="auto"/>
+        <w:rPr/>
+      </w:pPr>
+      <w:bookmarkStart w:colFirst="0" w:colLast="0" w:name="_heading=h.ur2wsprp1uwr" w:id="40"/>
+      <w:bookmarkEnd w:id="40"/>
+      <w:r>
+        <w:rPr>
+          <w:rtl w:val="0"/>
+        </w:rPr>
+        <w:t xml:space="preserve">3.1.1 Bibliotecas utilizadas</w:t>
+      </w:r>
+    </w:p>
+    <w:p>
+      <w:pPr>
+        <w:spacing w:line="360" w:lineRule="auto"/>
+        <w:ind w:firstLine="850.3937007874017"/>
+        <w:rPr/>
+      </w:pPr>
+      <w:r>
+        <w:rPr>
+          <w:rtl w:val="0"/>
+        </w:rPr>
+        <w:t xml:space="preserve">O desenvolvimento deste trabalho foi realizado utilizando bibliotecas amplamente reconhecidas na área de ciência de dados. A biblioteca </w:t>
+      </w:r>
+      <w:r>
+        <w:rPr>
+          <w:rtl w:val="0"/>
+        </w:rPr>
+        <w:t xml:space="preserve">pandas</w:t>
+      </w:r>
+      <w:r>
+        <w:rPr>
+          <w:rtl w:val="0"/>
+        </w:rPr>
+        <w:t xml:space="preserve"> foi empregada para a manipulação de dados tabulares, sendo fundamental para a leitura, tratamento e análise das bases de dados. Para visualização de dados, utilizaram-se </w:t>
+      </w:r>
+      <w:r>
+        <w:rPr>
+          <w:rtl w:val="0"/>
+        </w:rPr>
+        <w:t xml:space="preserve">matplotlib.pyplot</w:t>
+      </w:r>
+      <w:r>
+        <w:rPr>
+          <w:rtl w:val="0"/>
+        </w:rPr>
+        <w:t xml:space="preserve"> e </w:t>
+      </w:r>
+      <w:r>
+        <w:rPr>
+          <w:rtl w:val="0"/>
+        </w:rPr>
+        <w:t xml:space="preserve">plotly.express</w:t>
+      </w:r>
+      <w:r>
+        <w:rPr>
+          <w:rtl w:val="0"/>
+        </w:rPr>
+        <w:t xml:space="preserve">, que possibilitam a construção de gráficos estáticos e interativos, respectivamente, permitindo uma análise visual mais rica e intuitiva. Além disso, funções estatísticas como assimetria e curtose foram calculadas com o auxílio da biblioteca </w:t>
+      </w:r>
+      <w:r>
+        <w:rPr>
+          <w:rtl w:val="0"/>
+        </w:rPr>
+        <w:t xml:space="preserve">scipy.stats</w:t>
+      </w:r>
+      <w:r>
+        <w:rPr>
+          <w:rtl w:val="0"/>
+        </w:rPr>
+        <w:t xml:space="preserve">. As importações podem ser conferidas na figura 2.</w:t>
+      </w:r>
+    </w:p>
+    <w:p>
+      <w:pPr>
+        <w:spacing w:line="360" w:lineRule="auto"/>
+        <w:ind w:firstLine="850.3937007874017"/>
+        <w:rPr/>
+      </w:pPr>
+      <w:r>
+        <w:rPr>
+          <w:rtl w:val="0"/>
+        </w:rPr>
+        <w:t xml:space="preserve">(</w:t>
+      </w:r>
+      <w:r>
+        <w:rPr>
+          <w:highlight w:val="yellow"/>
+          <w:rtl w:val="0"/>
+        </w:rPr>
+        <w:t xml:space="preserve">ao longo do desenvolvimento do projeto essa subseção será incrementada com as novas bibliotecas inseridas.</w:t>
+      </w:r>
+      <w:r>
+        <w:rPr>
+          <w:rtl w:val="0"/>
+        </w:rPr>
+        <w:t xml:space="preserve">) </w:t>
+      </w:r>
+    </w:p>
+    <w:p>
+      <w:pPr>
+        <w:keepNext w:val="1"/>
+        <w:keepLines w:val="1"/>
+        <w:spacing w:before="200" w:lineRule="auto"/>
+        <w:jc w:val="center"/>
+        <w:rPr/>
+      </w:pPr>
+      <w:bookmarkStart w:colFirst="0" w:colLast="0" w:name="_heading=h.3whwml4" w:id="30"/>
+      <w:bookmarkEnd w:id="30"/>
+      <w:r>
+        <w:rPr>
+          <w:b w:val="1"/>
+          <w:sz w:val="20"/>
+          <w:szCs w:val="20"/>
+          <w:rtl w:val="0"/>
+        </w:rPr>
+        <w:t xml:space="preserve">Figura 2 - Importação das bibliotecas. </w:t>
+      </w:r>
+      <w:r>
+        <w:rPr>
+          <w:rtl w:val="0"/>
+        </w:rPr>
+      </w:r>
+    </w:p>
+    <w:p>
+      <w:pPr>
+        <w:spacing w:line="360" w:lineRule="auto"/>
+        <w:ind w:firstLine="850.3937007874017"/>
+        <w:jc w:val="center"/>
+        <w:rPr/>
+      </w:pPr>
+      <w:r>
+        <w:rPr/>
+        <w:drawing>
+          <wp:inline distB="114300" distT="114300" distL="114300" distR="114300">
+            <wp:extent cx="3412747" cy="1927570"/>
+            <wp:effectExtent b="0" l="0" r="0" t="0"/>
+            <wp:docPr id="18" name="image1.png"/>
+            <a:graphic>
+              <a:graphicData uri="http://schemas.openxmlformats.org/drawingml/2006/picture">
+                <pic:pic>
+                  <pic:nvPicPr>
+                    <pic:cNvPr id="0" name="image1.png"/>
+                    <pic:cNvPicPr preferRelativeResize="0"/>
+                  </pic:nvPicPr>
+                  <pic:blipFill>
+                    <a:blip r:embed="rId11"/>
+                    <a:srcRect b="0" l="0" r="0" t="0"/>
+                    <a:stretch>
+                      <a:fillRect/>
+                    </a:stretch>
+                  </pic:blipFill>
+                  <pic:spPr>
+                    <a:xfrm>
+                      <a:off x="0" y="0"/>
+                      <a:ext cx="3412747" cy="1927570"/>
+                    </a:xfrm>
+                    <a:prstGeom prst="rect"/>
+                    <a:ln/>
+                  </pic:spPr>
+                </pic:pic>
+              </a:graphicData>
+            </a:graphic>
+          </wp:inline>
+        </w:drawing>
+      </w:r>
+      <w:r>
+        <w:rPr>
+          <w:rtl w:val="0"/>
+        </w:rPr>
+      </w:r>
+    </w:p>
+    <w:p>
+      <w:pPr>
+        <w:spacing w:line="360" w:lineRule="auto"/>
+        <w:ind w:firstLine="850.3937007874017"/>
+        <w:jc w:val="center"/>
+        <w:rPr>
+          <w:b w:val="1"/>
+          <w:sz w:val="20"/>
+          <w:szCs w:val="20"/>
+        </w:rPr>
+      </w:pPr>
+      <w:r>
+        <w:rPr>
+          <w:b w:val="1"/>
+          <w:sz w:val="20"/>
+          <w:szCs w:val="20"/>
+          <w:rtl w:val="0"/>
+        </w:rPr>
+        <w:t xml:space="preserve">Fonte: Autoria própria.</w:t>
+      </w:r>
+    </w:p>
+    <w:p>
+      <w:pPr>
+        <w:pStyle w:val="Heading3"/>
+        <w:spacing w:after="300" w:before="300" w:line="240" w:lineRule="auto"/>
+        <w:rPr/>
+      </w:pPr>
+      <w:bookmarkStart w:colFirst="0" w:colLast="0" w:name="_heading=h.tu00zw1yg065" w:id="41"/>
+      <w:bookmarkEnd w:id="41"/>
+      <w:r>
+        <w:rPr>
+          <w:rtl w:val="0"/>
+        </w:rPr>
+        <w:t xml:space="preserve">3.1.2 Tratamento da base de dados</w:t>
+      </w:r>
+    </w:p>
+    <w:p>
+      <w:pPr>
+        <w:spacing w:line="360" w:lineRule="auto"/>
+        <w:ind w:firstLine="850.3937007874017"/>
+        <w:rPr/>
+      </w:pPr>
+      <w:r>
+        <w:rPr>
+          <w:rtl w:val="0"/>
+        </w:rPr>
+        <w:t xml:space="preserve">Inicialmente todas as bases de dados foram importadas no projeto, como é possível visualizar na figura 3.</w:t>
+      </w:r>
+    </w:p>
+    <w:p>
+      <w:pPr>
+        <w:keepNext w:val="1"/>
+        <w:keepLines w:val="1"/>
+        <w:spacing w:before="200" w:lineRule="auto"/>
+        <w:jc w:val="center"/>
+        <w:rPr/>
+      </w:pPr>
+      <w:bookmarkStart w:colFirst="0" w:colLast="0" w:name="_heading=h.3whwml4" w:id="30"/>
+      <w:bookmarkEnd w:id="30"/>
+      <w:r>
+        <w:rPr>
+          <w:b w:val="1"/>
+          <w:sz w:val="20"/>
+          <w:szCs w:val="20"/>
+          <w:rtl w:val="0"/>
+        </w:rPr>
+        <w:t xml:space="preserve">Figura 3 - Importação das bases de dados. </w:t>
+      </w:r>
+      <w:r>
+        <w:rPr>
+          <w:rtl w:val="0"/>
+        </w:rPr>
+      </w:r>
+    </w:p>
+    <w:p>
+      <w:pPr>
+        <w:spacing w:line="360" w:lineRule="auto"/>
+        <w:ind w:firstLine="850.3937007874017"/>
+        <w:rPr/>
+      </w:pPr>
+      <w:r>
+        <w:rPr/>
+        <w:drawing>
+          <wp:inline distB="114300" distT="114300" distL="114300" distR="114300">
+            <wp:extent cx="4505325" cy="1704975"/>
+            <wp:effectExtent b="0" l="0" r="0" t="0"/>
+            <wp:docPr id="15" name="image2.png"/>
+            <a:graphic>
+              <a:graphicData uri="http://schemas.openxmlformats.org/drawingml/2006/picture">
+                <pic:pic>
+                  <pic:nvPicPr>
+                    <pic:cNvPr id="0" name="image2.png"/>
+                    <pic:cNvPicPr preferRelativeResize="0"/>
+                  </pic:nvPicPr>
+                  <pic:blipFill>
+                    <a:blip r:embed="rId12"/>
+                    <a:srcRect b="0" l="0" r="0" t="0"/>
+                    <a:stretch>
+                      <a:fillRect/>
+                    </a:stretch>
+                  </pic:blipFill>
+                  <pic:spPr>
+                    <a:xfrm>
+                      <a:off x="0" y="0"/>
+                      <a:ext cx="4505325" cy="1704975"/>
+                    </a:xfrm>
+                    <a:prstGeom prst="rect"/>
+                    <a:ln/>
+                  </pic:spPr>
+                </pic:pic>
+              </a:graphicData>
+            </a:graphic>
+          </wp:inline>
+        </w:drawing>
+      </w:r>
+      <w:r>
+        <w:rPr>
+          <w:rtl w:val="0"/>
+        </w:rPr>
+      </w:r>
+    </w:p>
+    <w:p>
+      <w:pPr>
+        <w:spacing w:line="360" w:lineRule="auto"/>
+        <w:ind w:firstLine="850.3937007874017"/>
+        <w:jc w:val="center"/>
+        <w:rPr/>
+      </w:pPr>
+      <w:r>
+        <w:rPr>
+          <w:b w:val="1"/>
+          <w:sz w:val="20"/>
+          <w:szCs w:val="20"/>
+          <w:rtl w:val="0"/>
+        </w:rPr>
+        <w:t xml:space="preserve">Fonte: Autoria própria.</w:t>
+      </w:r>
+      <w:r>
+        <w:rPr>
+          <w:rtl w:val="0"/>
+        </w:rPr>
+      </w:r>
+    </w:p>
+    <w:p>
+      <w:pPr>
+        <w:spacing w:line="360" w:lineRule="auto"/>
+        <w:ind w:firstLine="850.3937007874017"/>
+        <w:rPr/>
+      </w:pPr>
+      <w:r>
+        <w:rPr>
+          <w:rtl w:val="0"/>
+        </w:rPr>
+        <w:t xml:space="preserve">Após a importação, os dados passaram por um processo de consolidação por meio da união (merge) das tabelas, utilizando chaves primárias como </w:t>
+      </w:r>
+      <w:r>
+        <w:rPr>
+          <w:rtl w:val="0"/>
+        </w:rPr>
+        <w:t xml:space="preserve">order_id</w:t>
+      </w:r>
+      <w:r>
+        <w:rPr>
+          <w:rtl w:val="0"/>
+        </w:rPr>
+        <w:t xml:space="preserve">, </w:t>
+      </w:r>
+      <w:r>
+        <w:rPr>
+          <w:rtl w:val="0"/>
+        </w:rPr>
+        <w:t xml:space="preserve">product_id</w:t>
+      </w:r>
+      <w:r>
+        <w:rPr>
+          <w:rtl w:val="0"/>
+        </w:rPr>
+        <w:t xml:space="preserve">, </w:t>
+      </w:r>
+      <w:r>
+        <w:rPr>
+          <w:rtl w:val="0"/>
+        </w:rPr>
+        <w:t xml:space="preserve">seller_id</w:t>
+      </w:r>
+      <w:r>
+        <w:rPr>
+          <w:rtl w:val="0"/>
+        </w:rPr>
+        <w:t xml:space="preserve"> e </w:t>
+      </w:r>
+      <w:r>
+        <w:rPr>
+          <w:rtl w:val="0"/>
+        </w:rPr>
+        <w:t xml:space="preserve">customer_id.</w:t>
+      </w:r>
+    </w:p>
+    <w:p>
+      <w:pPr>
+        <w:spacing w:line="360" w:lineRule="auto"/>
+        <w:ind w:firstLine="850.3937007874017"/>
+        <w:rPr/>
+      </w:pPr>
+      <w:r>
+        <w:rPr>
+          <w:rtl w:val="0"/>
+        </w:rPr>
+        <w:t xml:space="preserve">O objetivo foi construir uma única base integrada que reunisse informações completas sobre cada pedido, incluindo produtos adquiridos, avaliações dos clientes, forma de pagamento, dados dos vendedores e localização geográfica. Esta etapa foi essencial para garantir a consistência e a integridade das informações utilizadas nas análises subsequentes.</w:t>
+      </w:r>
+    </w:p>
+    <w:p>
+      <w:pPr>
+        <w:spacing w:line="360" w:lineRule="auto"/>
+        <w:ind w:firstLine="850.3937007874017"/>
+        <w:rPr/>
+      </w:pPr>
+      <w:r>
+        <w:rPr>
+          <w:rtl w:val="0"/>
+        </w:rPr>
+        <w:t xml:space="preserve">Durante o processo de tratamento da base de dados, diversas colunas foram removidas com o objetivo de otimizar o conjunto de dados para as análises propostas e evitar redundâncias ou informações irrelevantes para o escopo do projeto. Inicialmente, foram descartadas colunas de identificação como order_id, customer_id, product_id, seller_id, review_id e customer_unique_id, pois, apesar de essenciais para o relacionamento entre tabelas, essas chaves primárias e estrangeiras não contribuem diretamente para a análise de sentimentos ou para a modelagem preditiva de demanda.</w:t>
+      </w:r>
+    </w:p>
+    <w:p>
+      <w:pPr>
+        <w:spacing w:line="360" w:lineRule="auto"/>
+        <w:ind w:firstLine="850.3937007874017"/>
+        <w:rPr/>
+      </w:pPr>
+      <w:r>
+        <w:rPr>
+          <w:rtl w:val="0"/>
+        </w:rPr>
+        <w:t xml:space="preserve">Colunas relacionadas a datas intermediárias do processo logístico, como order_approved_at, order_delivered_carrier_date, shipping_limit_date, order_purchase_timestamp, order_delivered_customer_date e order_estimated_delivery_date, também foram excluídas. Embora úteis em outros contextos, como estudos logísticos ou de eficiência operacional, essas informações não foram consideradas relevantes para os objetivos principais deste trabalho, que se concentram na relação entre as avaliações dos clientes e a previsão de demanda.</w:t>
+      </w:r>
+    </w:p>
+    <w:p>
+      <w:pPr>
+        <w:spacing w:line="360" w:lineRule="auto"/>
+        <w:ind w:firstLine="850.3937007874017"/>
+        <w:rPr/>
+      </w:pPr>
+      <w:r>
+        <w:rPr>
+          <w:rtl w:val="0"/>
+        </w:rPr>
+        <w:t xml:space="preserve">Outras colunas descartadas incluem variáveis com baixa variabilidade ou pouca contribuição informativa, como product_name_lenght e product_description_lenght, que se referem ao tamanho textual dos nomes e descrições dos produtos. A presença de dados de CEP (seller_zip_code_prefix, customer_zip_code_prefix) também foi desconsiderada, uma vez que informações geográficas mais detalhadas poderiam ser extraídas da base de geolocalização, caso necessário.</w:t>
+      </w:r>
+    </w:p>
+    <w:p>
+      <w:pPr>
+        <w:spacing w:line="360" w:lineRule="auto"/>
+        <w:ind w:firstLine="850.3937007874017"/>
+        <w:rPr/>
+      </w:pPr>
+      <w:r>
+        <w:rPr>
+          <w:rtl w:val="0"/>
+        </w:rPr>
+        <w:t xml:space="preserve">Além disso, foram removidos registros duplicados e tratados valores ausentes em colunas essenciais para as análises, como review_comment_message e atributos do produto (peso, dimensões, categoria e quantidade de fotos). A eliminação de tais registros visou garantir a integridade do conjunto de dados e a consistência dos modelos analíticos e preditivos subsequentes.</w:t>
+      </w:r>
+    </w:p>
+    <w:p>
+      <w:pPr>
+        <w:spacing w:line="360" w:lineRule="auto"/>
+        <w:ind w:firstLine="850.3937007874017"/>
+        <w:rPr/>
+      </w:pPr>
+      <w:r>
+        <w:rPr>
+          <w:rtl w:val="0"/>
+        </w:rPr>
+        <w:t xml:space="preserve">Durante o decorrer do projeto, algumas colunas adicionais foram criadas com o intuito de enriquecer o conjunto de informações disponíveis para análise. Duas colunas temporais derivadas foram geradas: delivery_time, representando o tempo real de entrega do pedido (diferença entre a data de entrega e a data da compra), e delivery_time_estimated, que indica a diferença entre a data estimada de entrega e a data da compra. Essas variáveis são úteis para avaliar possíveis impactos no sentimento do cliente.</w:t>
+      </w:r>
+    </w:p>
+    <w:p>
+      <w:pPr>
+        <w:pStyle w:val="Heading3"/>
+        <w:spacing w:after="300" w:before="300" w:line="240" w:lineRule="auto"/>
+        <w:rPr/>
+      </w:pPr>
+      <w:bookmarkStart w:colFirst="0" w:colLast="0" w:name="_heading=h.jvgo7shuzzdj" w:id="42"/>
+      <w:bookmarkEnd w:id="42"/>
+      <w:r>
+        <w:rPr>
+          <w:rtl w:val="0"/>
+        </w:rPr>
+        <w:t xml:space="preserve">3.1.3 Análise exploratória dos dados</w:t>
+      </w:r>
+    </w:p>
+    <w:p>
+      <w:pPr>
+        <w:spacing w:line="360" w:lineRule="auto"/>
+        <w:ind w:firstLine="850.3937007874017"/>
+        <w:rPr/>
+      </w:pPr>
+      <w:r>
+        <w:rPr>
+          <w:rtl w:val="0"/>
+        </w:rPr>
+        <w:t xml:space="preserve">A análise exploratória teve como objetivo compreender as principais características dos dados, identificar padrões, tendências e possíveis anomalias. Inicialmente, foi realizada uma inspeção geral do DataFrame por meio de métodos como .head() e .info(), que forneceram uma visão inicial sobre as colunas, tipos de dados e presença de valores nulos. Em seguida, foram aplicadas medidas estatísticas descritivas para variáveis quantitativas, como média, mediana, desvio padrão, assimetria (</w:t>
+      </w:r>
+      <w:r>
+        <w:rPr>
+          <w:i w:val="1"/>
+          <w:rtl w:val="0"/>
+        </w:rPr>
+        <w:t xml:space="preserve">skewness</w:t>
+      </w:r>
+      <w:r>
+        <w:rPr>
+          <w:rtl w:val="0"/>
+        </w:rPr>
+        <w:t xml:space="preserve">) e curtose. Visualizações gráficas, construídas com matplotlib e plotly.express, também foram utilizadas para explorar a distribuição das variáveis, frequência de avaliações, categorias de produtos e formas de pagamento. Essa etapa permitiu não apenas validar a qualidade dos dados, mas também gerar insights iniciais para a etapa de modelagem preditiva.</w:t>
+      </w:r>
+      <w:r>
+        <w:rPr>
+          <w:rtl w:val="0"/>
+        </w:rPr>
+      </w:r>
+    </w:p>
+    <w:p>
+      <w:pPr>
+        <w:spacing w:line="360" w:lineRule="auto"/>
+        <w:ind w:firstLine="850.3937007874017"/>
+        <w:rPr/>
         <w:sectPr>
-          <w:headerReference r:id="rId11" w:type="default"/>
+          <w:headerReference r:id="rId13" w:type="default"/>
           <w:type w:val="nextPage"/>
           <w:pgSz w:h="16838" w:w="11906" w:orient="portrait"/>
-          <w:pgMar w:bottom="1134" w:top="1701" w:left="1701" w:right="1134" w:header="709" w:footer="709"/>
+          <w:pgMar w:bottom="1134" w:top="1701" w:left="1700.7874015748032" w:right="1134" w:header="709" w:footer="709"/>
           <w:pgNumType w:start="9"/>
         </w:sectPr>
       </w:pPr>
-      <w:bookmarkStart w:colFirst="0" w:colLast="0" w:name="_heading=h.kdbjggv78l1q" w:id="39"/>
-      <w:bookmarkEnd w:id="39"/>
-      <w:r>
-        <w:rPr>
-          <w:rtl w:val="0"/>
-        </w:rPr>
-        <w:t xml:space="preserve">3.2 Métodos </w:t>
-      </w:r>
       <w:r>
         <w:rPr>
           <w:rtl w:val="0"/>
@@ -11673,8 +12195,8 @@
         <w:jc w:val="center"/>
         <w:rPr/>
       </w:pPr>
-      <w:bookmarkStart w:colFirst="0" w:colLast="0" w:name="_heading=h.1hmsyys" w:id="40"/>
-      <w:bookmarkEnd w:id="40"/>
+      <w:bookmarkStart w:colFirst="0" w:colLast="0" w:name="_heading=h.1hmsyys" w:id="43"/>
+      <w:bookmarkEnd w:id="43"/>
       <w:r>
         <w:rPr>
           <w:rtl w:val="0"/>
@@ -12428,12 +12950,12 @@
               <wp:inline distB="0" distT="0" distL="0" distR="0">
                 <wp:extent cx="971550" cy="342900"/>
                 <wp:effectExtent b="0" l="0" r="0" t="0"/>
-                <wp:docPr id="16" name="image1.png"/>
+                <wp:docPr id="17" name="image3.png"/>
                 <a:graphic>
                   <a:graphicData uri="http://schemas.openxmlformats.org/drawingml/2006/picture">
                     <pic:pic>
                       <pic:nvPicPr>
-                        <pic:cNvPr id="0" name="image1.png"/>
+                        <pic:cNvPr id="0" name="image3.png"/>
                         <pic:cNvPicPr preferRelativeResize="0"/>
                       </pic:nvPicPr>
                       <pic:blipFill>
@@ -26687,7 +27209,7 @@
 
 <file path=customXML/item1.xml><?xml version="1.0" encoding="utf-8"?>
 <go:gDocsCustomXmlDataStorage xmlns:go="http://customooxmlschemas.google.com/" xmlns:r="http://schemas.openxmlformats.org/officeDocument/2006/relationships" uri="GoogleDocsCustomDataVersion2">
-  <go:docsCustomData xmlns:go="http://customooxmlschemas.google.com/" roundtripDataSignature="AMtx7mgvjqzB43dOWvwLpChHu7k8bnJSbQ==">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</go:docsCustomData>
+  <go:docsCustomData xmlns:go="http://customooxmlschemas.google.com/" roundtripDataSignature="AMtx7mji+RcGzkjcE9avbDfp5Wh1/QwNdA==">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</go:docsCustomData>
 </go:gDocsCustomXmlDataStorage>
 </file>
 

</xml_diff>